<commit_message>
Rootworks backup: 2026-07-29 12:29:25
</commit_message>
<xml_diff>
--- a/Clients/Adelante/Shared/Email Sequences/2026-07-28 - UK DTC - Apparel and Footwear - Founder-Owner.docx
+++ b/Clients/Adelante/Shared/Email Sequences/2026-07-28 - UK DTC - Apparel and Footwear - Founder-Owner.docx
@@ -153,15 +153,15 @@
         <w:pStyle w:val="BodyText"/>
       </w:pPr>
       <w:r>
-        <w:t xml:space="preserve">We build autonomous agents that resolve half a store’s inbox on their own, live within a week. If it isn’t resolving 50% of your inquiries within 10 days, you don’t pay.</w:t>
-      </w:r>
-    </w:p>
-    <w:p>
-      <w:pPr>
-        <w:pStyle w:val="BodyText"/>
-      </w:pPr>
-      <w:r>
-        <w:t xml:space="preserve">Want one built for {{company_name}}?</w:t>
+        <w:t xml:space="preserve">Fold, a UK brand doing 100+ inquiries a day, got every first response handled autonomously inside five weeks. We can have yours live in one.</w:t>
+      </w:r>
+    </w:p>
+    <w:p>
+      <w:pPr>
+        <w:pStyle w:val="BodyText"/>
+      </w:pPr>
+      <w:r>
+        <w:t xml:space="preserve">If it isn’t resolving 50% of your inquiries within 10 days, you don’t pay. Want one built for {{company_name}}?</w:t>
       </w:r>
     </w:p>
     <w:bookmarkEnd w:id="10"/>
@@ -213,7 +213,7 @@
         <w:pStyle w:val="BodyText"/>
       </w:pPr>
       <w:r>
-        <w:t xml:space="preserve">It gets there within 10 days, or you don’t pay.</w:t>
+        <w:t xml:space="preserve">Same setup we run for Fold here in the UK. It gets there within 10 days, or you don’t pay.</w:t>
       </w:r>
     </w:p>
     <w:p>

</xml_diff>